<commit_message>
Confirmar licencia de Urizen (Diego): gratuita, uso libre
Diego confirmo directamente que la licencia de Urizen es gratuita y de
uso libre para cualquier fin. Sin fichero de licencia en disco que lo
respalde por escrito -- misma situacion que "Miniature world" en
nuevosAssets, donde tambien confirmo de palabra tras consultar la pagina
del autor. A diferencia de los paquetes de PyxelSpace (que exigen
nombre+email del comprador en los creditos), Urizen no tiene esa
condicion.

Actualiza CLAUDE.md y añade la entrada 7.59 en
informe_implementacion_bosque.docx.
</commit_message>
<xml_diff>
--- a/informes/informe_implementacion_bosque.docx
+++ b/informes/informe_implementacion_bosque.docx
@@ -4556,6 +4556,22 @@
       </w:pPr>
       <w:r>
         <w:t xml:space="preserve">En vez de seguir ajustando textura por textura, se adopto un reparto por funcion: el suelo entero (los cinco biomas mas agua) vuelve a PyxelSpace Tilesets (grass.png/sand.png/stone.png/water.png, organicos, sin aspecto de rejilla, ya validados en 7.53-7.55), y Urizen se reserva por completo para lo que no es relleno continuo -- criaturas y decoracion puntual (arboles, rocas sueltas) en la pieza 2, que es literalmente para lo que ese pack esta diseñado segun lo encontrado al catalogarlo en 7.56. Los cinco recortes urizen_*.png de terreno quedan en disco sin usar, mismo criterio de no borrar del resto de la sesion. El mecanismo de las 8 variantes anti-repeticion de 7.55 no cambia, es independiente de que PNG se cargue -- verificado de nuevo con el arnes de Canvas2D simulado (sin periodicidad hasta desplazamiento 8, sin diagonales constantes) y con peticiones HTTP reales a los cuatro assets de PyxelSpace.</w:t>
+      </w:r>
+    </w:p>
+    <w:p>
+      <w:pPr>
+        <w:pStyle w:val="Heading2"/>
+      </w:pPr>
+      <w:r>
+        <w:t>7.59 Licencia de Urizen confirmada por Diego (25-08)</w:t>
+      </w:r>
+    </w:p>
+    <w:p>
+      <w:pPr>
+        <w:spacing w:after="150"/>
+      </w:pPr>
+      <w:r>
+        <w:t xml:space="preserve">Sin fichero de licencia junto a los PNG de Urizen en disco, Diego confirmo directamente que es gratuita y de uso libre para cualquier fin -- sin verificacion de Claude contra una fuente escrita, misma situacion que Miniature world en nuevosAssets, donde Diego tambien confirmo de palabra tras consultar la pagina del autor. A diferencia de los paquetes de PyxelSpace, que exigen nombre y email del comprador en los creditos, Urizen no tiene esa condicion.</w:t>
       </w:r>
     </w:p>
     <w:sectPr>

</xml_diff>

<commit_message>
Corregir 4 texturas de terreno mal extraidas: planas (grass/sand) o del tileset equivocado (rock/tundra=adoquin de PATH)
grass y sand eran recortes de un unico color literal. rock y tundra usaban por error la variante de ladrillo de la seccion PATH del pack base. Reextraidas de la seccion GROUND real de cada pack (rock: variante grava/piedra de PATH, unica aproximacion disponible sin bioma de montana dedicado). Cero cambios de codigo, swap de fichero puro. Verificado con getcolors() y render de referencia conjunto con agua+orillas. Documentado en CLAUDE.md e informe 7.65, incluyendo dos hallazgos no resueltos: canales de 1 celda leen como torre, y la mancha 'de clima' señalada por Diego se atribuye tentativamente (no confirmado) al sombreado de relieve existente.
</commit_message>
<xml_diff>
--- a/informes/informe_implementacion_bosque.docx
+++ b/informes/informe_implementacion_bosque.docx
@@ -4764,6 +4764,46 @@
       </w:pPr>
       <w:r>
         <w:t xml:space="preserve">Verificado con arnes mock-DOM (la textura de agua carga y se dibuja; la nueva alfa de la banda profunda se aplica correctamente) y con los renders de referencia en PIL ya mencionados. Pendiente: confirmacion de Diego en el visor real, y seguir catalogando que otras texturas del pack (WATER DETAILS, decoracion de terreno) hacen falta para acercarse mas a los mockups -- explicitamente no agotado en este incremento.</w:t>
+      </w:r>
+    </w:p>
+    <w:p>
+      <w:pPr>
+        <w:pStyle w:val="Heading2"/>
+      </w:pPr>
+      <w:r>
+        <w:t>7.65 Cuatro texturas de terreno mal extraidas: planas o del tileset equivocado (25-08, misma tarde)</w:t>
+      </w:r>
+    </w:p>
+    <w:p>
+      <w:pPr>
+        <w:spacing w:after="150"/>
+      </w:pPr>
+      <w:r>
+        <w:t xml:space="preserve">Con orillas y agua ya resueltas (7.62-7.64), Diego reviso una captura real del visor y fue tajante: "el suelo de la mayoria de sitios sigue siendo un color completo... la textura de montana no creo que sea del tileset que debes usar o si lo es no es la que se deberia poner porque eso es un suelo adoquinado, la arena tambien parece un solo color". Antes de tocar nada se verifico con PIL.Image.getcolors() en vez de diagnosticar a ojo, para no repetir el patron de suponer sin comprobar: mm_grass.png y mm_sand.png eran, literalmente, recortes de 16x16 de un unico color -- casi con toda seguridad tomados de una franja de referencia o plantilla, no de tierra real con textura. mm_rock.png y mm_tundra.png resultaron ser el mismo recorte por error: la variante de ladrillo/adoquin rectangular de la seccion PATH del pack base, visible a ojo como suelo pavimentado con lineas de mortero y brotes de maleza -- exactamente lo que describio Diego.</w:t>
+      </w:r>
+    </w:p>
+    <w:p>
+      <w:pPr>
+        <w:spacing w:after="150"/>
+      </w:pPr>
+      <w:r>
+        <w:t xml:space="preserve">Correccion: se reextrajo cada textura de la seccion GROUND real de su pack correspondiente, evitando las zonas decorativas que rompen el tileo. Hierba desde el pack base (0,0,16,16). Arena desde Mini-Medieval-Desert-v2.2, una franja limpia de 16x8 duplicada verticalmente para llenar 16x16 -- la seccion GROUND de Desert solo trae 8px de alto de suelo liso antes de la vegetacion. Tundra desde Mini-Medieval-Arctic-v2.1 (0,0,16,16): un tono crema palido con motas grises redondeadas, el tono de tundra helada propio del pack, no nieve blanca literal. Montana: sin bioma de montana dedicado en ningun pack comprado -- limitacion ya conocida, reconfirmada una vez mas -- se cambio de la variante ladrillo de PATH a la variante grava/piedra suelta de la misma seccion, un moteado irregular que lee como roca suelta y no como pavimento, la aproximacion menos mala disponible. Las cuatro se confirmaron tileables sin costura visible mediante un render PIL de 6x6 antes de copiarlas al repositorio. Cero cambios de codigo: es un swap de fichero puro sobre los mismos cuatro nombres que ya referenciaba RUTA_TEXTURAS.</w:t>
+      </w:r>
+    </w:p>
+    <w:p>
+      <w:pPr>
+        <w:spacing w:after="150"/>
+      </w:pPr>
+      <w:r>
+        <w:t xml:space="preserve">Verificacion: recuento de colores tras el swap -- hierba 2, arena 2, montana 4, tundra 2, ninguna ya de un solo color -- y confirmacion visual de que ninguna es ya la textura de ladrillo. Se genero un render de referencia combinando las cinco texturas de bioma, el agua con olas y ambos juegos de orilla sobre un mapa mixto, para comprobar que el tinte suave de bosque/pradera (alfa 0.18) sigue leyendose bien ahora que la hierba de base es una textura real y no un color plano -- se confirma que si. No se ejecuto arnes mock-DOM para este cambio en concreto porque no hay logica nueva que verificar -- es un swap de asset puro sobre codigo ya probado; el recuento de colores y el render conjunto son la verificacion real aqui. Pendiente, como siempre: confirmacion de Diego en el visor real con estas texturas.</w:t>
+      </w:r>
+    </w:p>
+    <w:p>
+      <w:pPr>
+        <w:spacing w:after="150"/>
+      </w:pPr>
+      <w:r>
+        <w:t xml:space="preserve">Dos hallazgos detectados al revisar el render de este incremento, no resueltos y comunicados a Diego junto con esta entrada en vez de guardarselos: (1) un cuerpo de agua de una sola celda de ancho queda compuesto por dos esquinas del sistema de orillas apiladas verticalmente, y a la escala del mapa se lee como una estructura o monumento en vez de agua -- el sistema de esquina+borde no tiene un tramo recto que ofrecer en canales de 1 celda; sin resolver, requiere decidir con Diego si se anade una pieza dedicada o se excluye el agua de 1 celda del sistema de orillas. (2) la mancha diagonal oscura que Diego atribuyo a "filtros de clima" no corresponde a ningun overlay de clima -- no existe ese codigo en vista_web.py, confirmado por busqueda explicita -- la atribucion tentativa, no verificada pixel a pixel, es el sombreado de relieve por elevacion ya existente (paso 3 de dibujarTerreno). Se deja marcado como no confirmado en vez de presentarlo como resuelto.</w:t>
       </w:r>
     </w:p>
     <w:sectPr>

</xml_diff>

<commit_message>
Retirar el sistema de orillas por completo: agua y tierra sin transicion
Diego lo comparo con su propia construccion en Tiled (anillo tierra/barro + espuma, adaptado al bioma) y señalo que la unificacion a arena de 7.68 abandonaba precisamente esa adaptacion. Tras varias rondas sin converger (v1 festoneado, v2/v3 anillo en agua, v4/v4.1 anillo en tierra, verde mal extraido, unificacion a arena) decidio cortar el ciclo en vez de seguir iterando sobre la pieza. Se elimina dibujarAnilloOrilla/dibujarCapaOrillas/orillaCargada/juegoOrillaPara de vista_web.py, las 12 entradas orilla_* de RUTA_TEXTURAS y las 12 piezas mm_orilla_*.png. Hoy: agua pinta su textura, tierra pinta la de su bioma, sin transicion entre ambas. Verificado con render de referencia fiel al algoritmo (rectangular, laguna en L, laguna pequeña en desierto).
</commit_message>
<xml_diff>
--- a/informes/informe_implementacion_bosque.docx
+++ b/informes/informe_implementacion_bosque.docx
@@ -4916,6 +4916,38 @@
       </w:pPr>
       <w:r>
         <w:t xml:space="preserve">Elegida la opcion (b): un reborde de arena alrededor de una laguna en hierba es una convencion visual habitual y aceptable en pixel art, preferible a una arquitectura nueva sin validar solo para un subconjunto de biomas. juegoOrillaPara() ahora siempre devuelve orilla_; las 8 piezas mm_orilla_verde_*.png (la construccion equivocada) se eliminaron del repositorio al no tener ya ninguna referencia en el codigo; BIOMAS_ORILLA_VERDE se retiro. Verificado con un render de referencia sobre los 4 biomas con agua (bosque, tundra, montaña, desierto): mismo anillo, misma orientacion correcta, coherente entre todos. Decision revisable: si en el futuro aparece un juego verde genuinamente componible, o si se decide construir el pipeline de estampado para lagunas pequeñas, juegoOrillaPara() es el punto unico de extension.</w:t>
+      </w:r>
+    </w:p>
+    <w:p>
+      <w:pPr>
+        <w:pStyle w:val="Heading2"/>
+      </w:pPr>
+      <w:r>
+        <w:t>7.69 Se retira el sistema de orillas por completo (26-08)</w:t>
+      </w:r>
+    </w:p>
+    <w:p>
+      <w:pPr>
+        <w:spacing w:after="150"/>
+      </w:pPr>
+      <w:r>
+        <w:t xml:space="preserve">Diego comparo el render de la unificacion a "arena" (7.68) con una construccion propia hecha a mano en Tiled -- un anillo de tierra/barro oscuro con remate de espuma blanca, visualmente distinto de la arena beige usada -- y señalo que la orilla debia adaptarse al bioma, precisamente lo que la unificacion acababa de abandonar. Repasando el hilo completo (festoneado v1, esquina+borde sobre agua v2/v3, esquina+borde sobre tierra v4, reorientacion v4.1, verde mal extraido, unificacion a arena) sin haber llegado a un resultado aceptado en ninguna iteracion, decidio cortar el ciclo: "esto se esta haciendo bola, no consigues el resultado que yo quiero".</w:t>
+      </w:r>
+    </w:p>
+    <w:p>
+      <w:pPr>
+        <w:spacing w:after="150"/>
+      </w:pPr>
+      <w:r>
+        <w:t xml:space="preserve">Se retiro el sistema entero en vez de seguir iterando sobre la pieza: dibujarAnilloOrilla, dibujarCapaOrillas, orillaCargada y juegoOrillaPara se eliminaron de vista_web.py; las 12 entradas orilla_* de RUTA_TEXTURAS y las 12 piezas mm_orilla_*.png correspondientes se eliminaron del repositorio. Verificado con un render de referencia fiel al algoritmo real (agua rectangular, laguna en L, laguna pequeña sobre desierto): la celda de agua pinta su textura de olas y banda de profundidad, la celda de tierra vecina pinta solo la textura de su bioma, sin ninguna pieza de transicion -- un corte limpio, sin festoneado ni anillo.</w:t>
+      </w:r>
+    </w:p>
+    <w:p>
+      <w:pPr>
+        <w:spacing w:after="150"/>
+      </w:pPr>
+      <w:r>
+        <w:t xml:space="preserve">Pendiente real, no resuelto por esta decision: si en el futuro se retoma la orilla, la leccion de esta ronda es no reanudar sobre piezas de 8x8 sueltas sin que Diego tenga primero una referencia visual concreta y aprobada (como hizo en Tiled) de que construccion seguir, en vez de iterar a ciegas sobre variantes de assets.</w:t>
       </w:r>
     </w:p>
     <w:sectPr>

</xml_diff>